<commit_message>
Make 20 min at room temperature the default ligation
Sticky ends with a small insert do not need an overnight ligation;
Thermo's own T4 ligase protocol gives 10 min at 22 C for cohesive ends.

Add the molar ratio the 1:250 dilution actually produces (50 ng vector =
11 fmol = 0.55 nM against 4.0 nM duplex, about 7:1, where undiluted
would be 1800:1), and keep 16 C overnight as the fallback, since the
EcoRI AATT overhang is four A/T bases and its transient pairing is
short-lived at warmer bench temperatures.

Rebuild the PDF (8 pages) and the Word file.

Co-Authored-By: Claude Opus 5 <noreply@anthropic.com>
Claude-Session: https://claude.ai/code/session_01YKjE9AgL42JVW69cPJUTKW
</commit_message>
<xml_diff>
--- a/protocolo_clonaje_shRNA_pSI-H1.docx
+++ b/protocolo_clonaje_shRNA_pSI-H1.docx
@@ -2572,37 +2572,259 @@
     </w:tbl>
     <w:p>
       <w:pPr>
+        <w:pStyle w:val="BodyText"/>
+      </w:pPr>
+      <w:r>
+        <w:rPr>
+          <w:bCs/>
+          <w:b/>
+        </w:rPr>
+        <w:t xml:space="preserve">Incubación: 20 min a temperatura ambiente.</w:t>
+      </w:r>
+      <w:r>
+        <w:t xml:space="preserve"> </w:t>
+      </w:r>
+      <w:r>
+        <w:t xml:space="preserve">Con extremos cohesivos y un inserto pequeño es de sobra — el propio protocolo de T4 ligasa de Thermo da 10 min a 22 °C para extremos cohesivos. No necesitas la noche entera.</w:t>
+      </w:r>
+    </w:p>
+    <w:p>
+      <w:pPr>
+        <w:pStyle w:val="BodyText"/>
+      </w:pPr>
+      <w:r>
+        <w:t xml:space="preserve">La relación molar que te queda con la dilución 1:250 es la óptima para esto:</w:t>
+      </w:r>
+    </w:p>
+    <w:tbl>
+      <w:tblPr>
+        <w:tblStyle w:val="Table"/>
+        <w:tblW w:type="auto" w:w="0"/>
+        <w:tblLook w:firstRow="1" w:lastRow="0" w:firstColumn="0" w:lastColumn="0" w:noHBand="0" w:noVBand="0" w:val="0020"/>
+        <w:jc w:val="start"/>
+      </w:tblPr>
+      <w:tblGrid>
+        <w:gridCol w:w="2640"/>
+        <w:gridCol w:w="2640"/>
+        <w:gridCol w:w="2640"/>
+      </w:tblGrid>
+      <w:tr>
+        <w:trPr>
+          <w:tblHeader w:val="true"/>
+        </w:trPr>
+        <w:tc>
+          <w:tcPr/>
+          <w:p>
+            <w:pPr>
+              <w:pStyle w:val="Compact"/>
+            </w:pPr>
+          </w:p>
+        </w:tc>
+        <w:tc>
+          <w:tcPr/>
+          <w:p>
+            <w:pPr>
+              <w:pStyle w:val="Compact"/>
+              <w:jc w:val="left"/>
+            </w:pPr>
+            <w:r>
+              <w:t xml:space="preserve">Cantidad</w:t>
+            </w:r>
+          </w:p>
+        </w:tc>
+        <w:tc>
+          <w:tcPr/>
+          <w:p>
+            <w:pPr>
+              <w:pStyle w:val="Compact"/>
+              <w:jc w:val="left"/>
+            </w:pPr>
+            <w:r>
+              <w:t xml:space="preserve">Concentración final</w:t>
+            </w:r>
+          </w:p>
+        </w:tc>
+      </w:tr>
+      <w:tr>
+        <w:tc>
+          <w:tcPr/>
+          <w:p>
+            <w:pPr>
+              <w:pStyle w:val="Compact"/>
+              <w:jc w:val="left"/>
+            </w:pPr>
+            <w:r>
+              <w:t xml:space="preserve">Vector (6.868 pb)</w:t>
+            </w:r>
+          </w:p>
+        </w:tc>
+        <w:tc>
+          <w:tcPr/>
+          <w:p>
+            <w:pPr>
+              <w:pStyle w:val="Compact"/>
+              <w:jc w:val="left"/>
+            </w:pPr>
+            <w:r>
+              <w:t xml:space="preserve">50 ng = 11 fmol</w:t>
+            </w:r>
+          </w:p>
+        </w:tc>
+        <w:tc>
+          <w:tcPr/>
+          <w:p>
+            <w:pPr>
+              <w:pStyle w:val="Compact"/>
+              <w:jc w:val="left"/>
+            </w:pPr>
+            <w:r>
+              <w:t xml:space="preserve">0,55 nM</w:t>
+            </w:r>
+          </w:p>
+        </w:tc>
+      </w:tr>
+      <w:tr>
+        <w:tc>
+          <w:tcPr/>
+          <w:p>
+            <w:pPr>
+              <w:pStyle w:val="Compact"/>
+              <w:jc w:val="left"/>
+            </w:pPr>
+            <w:r>
+              <w:t xml:space="preserve">Dúplex (1:250, 2 µL)</w:t>
+            </w:r>
+          </w:p>
+        </w:tc>
+        <w:tc>
+          <w:tcPr/>
+          <w:p>
+            <w:pPr>
+              <w:pStyle w:val="Compact"/>
+              <w:jc w:val="left"/>
+            </w:pPr>
+            <w:r>
+              <w:t xml:space="preserve">—</w:t>
+            </w:r>
+          </w:p>
+        </w:tc>
+        <w:tc>
+          <w:tcPr/>
+          <w:p>
+            <w:pPr>
+              <w:pStyle w:val="Compact"/>
+              <w:jc w:val="left"/>
+            </w:pPr>
+            <w:r>
+              <w:t xml:space="preserve">4,0 nM</w:t>
+            </w:r>
+          </w:p>
+        </w:tc>
+      </w:tr>
+      <w:tr>
+        <w:tc>
+          <w:tcPr/>
+          <w:p>
+            <w:pPr>
+              <w:pStyle w:val="Compact"/>
+              <w:jc w:val="left"/>
+            </w:pPr>
+            <w:r>
+              <w:rPr>
+                <w:bCs/>
+                <w:b/>
+              </w:rPr>
+              <w:t xml:space="preserve">Relación inserto:vector</w:t>
+            </w:r>
+          </w:p>
+        </w:tc>
+        <w:tc>
+          <w:tcPr/>
+          <w:p>
+            <w:pPr>
+              <w:pStyle w:val="Compact"/>
+            </w:pPr>
+          </w:p>
+        </w:tc>
+        <w:tc>
+          <w:tcPr/>
+          <w:p>
+            <w:pPr>
+              <w:pStyle w:val="Compact"/>
+              <w:jc w:val="left"/>
+            </w:pPr>
+            <w:r>
+              <w:rPr>
+                <w:bCs/>
+                <w:b/>
+              </w:rPr>
+              <w:t xml:space="preserve">≈ 7:1</w:t>
+            </w:r>
+          </w:p>
+        </w:tc>
+      </w:tr>
+    </w:tbl>
+    <w:p>
+      <w:pPr>
+        <w:pStyle w:val="BodyText"/>
+      </w:pPr>
+      <w:r>
+        <w:rPr>
+          <w:iCs/>
+          <w:i/>
+        </w:rPr>
+        <w:t xml:space="preserve">(Sin diluir sería 1.800:1, de ahí la dilución: a esa relación lo que obtienes son concatémeros.)</w:t>
+      </w:r>
+    </w:p>
+    <w:p>
+      <w:pPr>
+        <w:pStyle w:val="BodyText"/>
+      </w:pPr>
+      <w:r>
+        <w:rPr>
+          <w:bCs/>
+          <w:b/>
+        </w:rPr>
+        <w:t xml:space="preserve">Cuándo sí merece la pena pasar a 16 °C toda la noche:</w:t>
+      </w:r>
+      <w:r>
+        <w:t xml:space="preserve"> </w:t>
+      </w:r>
+      <w:r>
+        <w:t xml:space="preserve">el extremo de EcoRI es</w:t>
+      </w:r>
+      <w:r>
+        <w:t xml:space="preserve"> </w:t>
+      </w:r>
+      <w:r>
+        <w:rPr>
+          <w:rStyle w:val="VerbatimChar"/>
+        </w:rPr>
+        <w:t xml:space="preserve">AATT</w:t>
+      </w:r>
+      <w:r>
+        <w:t xml:space="preserve">, cuatro bases y todas A/T, así que el apareamiento transitorio que la ligasa tiene que "pillar" es débil y se deshace rápido al subir la temperatura. A 16 °C ese intermedio dura más. En la práctica:</w:t>
+      </w:r>
+    </w:p>
+    <w:p>
+      <w:pPr>
         <w:numPr>
           <w:ilvl w:val="0"/>
           <w:numId w:val="1008"/>
         </w:numPr>
-        <w:pStyle w:val="Compact"/>
-      </w:pPr>
-      <w:r>
-        <w:rPr>
-          <w:bCs/>
-          <w:b/>
-        </w:rPr>
-        <w:t xml:space="preserve">16 °C toda la noche</w:t>
-      </w:r>
-      <w:r>
-        <w:t xml:space="preserve"> </w:t>
-      </w:r>
-      <w:r>
-        <w:t xml:space="preserve">(mejor rendimiento) o</w:t>
-      </w:r>
-      <w:r>
-        <w:t xml:space="preserve"> </w:t>
-      </w:r>
-      <w:r>
-        <w:rPr>
-          <w:bCs/>
-          <w:b/>
-        </w:rPr>
-        <w:t xml:space="preserve">temperatura ambiente 1–2 h</w:t>
-      </w:r>
-      <w:r>
-        <w:t xml:space="preserve">.</w:t>
+      </w:pPr>
+      <w:r>
+        <w:rPr>
+          <w:bCs/>
+          <w:b/>
+        </w:rPr>
+        <w:t xml:space="preserve">20 min a TA</w:t>
+      </w:r>
+      <w:r>
+        <w:t xml:space="preserve"> </w:t>
+      </w:r>
+      <w:r>
+        <w:t xml:space="preserve">→ primera opción, y lo normal es que funcione.</w:t>
       </w:r>
     </w:p>
     <w:p>
@@ -2611,10 +2833,41 @@
           <w:ilvl w:val="0"/>
           <w:numId w:val="1008"/>
         </w:numPr>
-        <w:pStyle w:val="Compact"/>
+      </w:pPr>
+      <w:r>
+        <w:rPr>
+          <w:bCs/>
+          <w:b/>
+        </w:rPr>
+        <w:t xml:space="preserve">16 °C toda la noche</w:t>
+      </w:r>
+      <w:r>
+        <w:t xml:space="preserve"> </w:t>
+      </w:r>
+      <w:r>
+        <w:t xml:space="preserve">→ si en la primera ronda salen pocas colonias, o si tu poyata está a 25–26 °C en verano.</w:t>
+      </w:r>
+    </w:p>
+    <w:p>
+      <w:pPr>
+        <w:numPr>
+          <w:ilvl w:val="0"/>
+          <w:numId w:val="1008"/>
+        </w:numPr>
       </w:pPr>
       <w:r>
         <w:t xml:space="preserve">L2 te dice cuánto fondo tienes por vector mal cortado/religado. Si L2 da tantas colonias como L1, repite la digestión.</w:t>
+      </w:r>
+    </w:p>
+    <w:p>
+      <w:pPr>
+        <w:numPr>
+          <w:ilvl w:val="0"/>
+          <w:numId w:val="1008"/>
+        </w:numPr>
+      </w:pPr>
+      <w:r>
+        <w:t xml:space="preserve">No inactives la ligasa por calor antes de transformar: con 20 min de ligación transformas directamente, y así no pierdes producto.</w:t>
       </w:r>
     </w:p>
     <w:p>
@@ -4283,7 +4536,7 @@
               <w:jc w:val="left"/>
             </w:pPr>
             <w:r>
-              <w:t xml:space="preserve">Gel y purificación del vector → ligación a 16 °C O/N</w:t>
+              <w:t xml:space="preserve">Gel y purificación del vector → ligación 20 min TA → transformación</w:t>
             </w:r>
           </w:p>
         </w:tc>
@@ -4309,7 +4562,7 @@
               <w:jc w:val="left"/>
             </w:pPr>
             <w:r>
-              <w:t xml:space="preserve">Transformación → placas O/N</w:t>
+              <w:t xml:space="preserve">Placas O/N</w:t>
             </w:r>
           </w:p>
         </w:tc>

</xml_diff>